<commit_message>
feat: Added cluster chart and reccomendation memorandum
</commit_message>
<xml_diff>
--- a/W10-Predictive_Insights/Staggs_Colton_Project10.docx
+++ b/W10-Predictive_Insights/Staggs_Colton_Project10.docx
@@ -169,7 +169,72 @@
         </w:rPr>
       </w:pPr>
       <w:r>
-        <w:rPr/>
+        <w:rPr>
+          <w:rFonts w:ascii="Abade" w:hAnsi="Abade"/>
+          <w:color w:val="auto"/>
+        </w:rPr>
+      </w:r>
+    </w:p>
+    <w:p>
+      <w:pPr>
+        <w:pStyle w:val="BodyText"/>
+        <w:bidi w:val="0"/>
+        <w:jc w:val="left"/>
+        <w:rPr>
+          <w:rFonts w:ascii="Abade" w:hAnsi="Abade"/>
+          <w:color w:val="auto"/>
+          <w:sz w:val="24"/>
+          <w:szCs w:val="24"/>
+        </w:rPr>
+      </w:pPr>
+      <w:r>
+        <w:rPr>
+          <w:rFonts w:ascii="Abade" w:hAnsi="Abade"/>
+          <w:color w:val="auto"/>
+          <w:sz w:val="24"/>
+          <w:szCs w:val="24"/>
+        </w:rPr>
+        <w:tab/>
+      </w:r>
+      <w:r>
+        <w:rPr>
+          <w:rFonts w:ascii="Abade" w:hAnsi="Abade"/>
+          <w:color w:val="auto"/>
+          <w:sz w:val="24"/>
+          <w:szCs w:val="24"/>
+        </w:rPr>
+        <w:t>When approaching the decision of what to represent, I had struggled to find a bit of data that would be informative and also work with the scatterplot. Unfortunately, when choosing how the clusters are classified, PowerBI doesn’t let you choose how they are classified. This leads to a case where you have to cycle between changing the topic and generating the clusters to see if they make sense.</w:t>
+      </w:r>
+    </w:p>
+    <w:p>
+      <w:pPr>
+        <w:pStyle w:val="BodyText"/>
+        <w:bidi w:val="0"/>
+        <w:jc w:val="left"/>
+        <w:rPr>
+          <w:rFonts w:ascii="Abade" w:hAnsi="Abade"/>
+          <w:color w:val="auto"/>
+          <w:sz w:val="24"/>
+          <w:szCs w:val="24"/>
+        </w:rPr>
+      </w:pPr>
+      <w:r>
+        <w:rPr>
+          <w:rFonts w:ascii="Abade" w:hAnsi="Abade"/>
+          <w:color w:val="auto"/>
+          <w:sz w:val="24"/>
+          <w:szCs w:val="24"/>
+        </w:rPr>
+        <w:tab/>
+      </w:r>
+      <w:r>
+        <w:rPr>
+          <w:rFonts w:ascii="Abade" w:hAnsi="Abade"/>
+          <w:color w:val="auto"/>
+          <w:sz w:val="24"/>
+          <w:szCs w:val="24"/>
+        </w:rPr>
+        <w:t>The results show the amount of orders that contain a product in relation to the amount of money they have made. This result shows that the top selling products are in minimal orders. This can show what products that the customers are the most interested in and give a general idea of what areas product expansion might lead to more customer gain.</w:t>
       </w:r>
     </w:p>
     <w:p>
@@ -179,15 +244,15 @@
         <w:jc w:val="left"/>
         <w:rPr>
           <w:rFonts w:ascii="Abade" w:hAnsi="Abade"/>
-          <w:sz w:val="28"/>
-          <w:szCs w:val="28"/>
-        </w:rPr>
-      </w:pPr>
-      <w:r>
-        <w:rPr>
-          <w:rFonts w:ascii="Abade" w:hAnsi="Abade"/>
-          <w:sz w:val="28"/>
-          <w:szCs w:val="28"/>
+          <w:sz w:val="24"/>
+          <w:szCs w:val="24"/>
+        </w:rPr>
+      </w:pPr>
+      <w:r>
+        <w:rPr>
+          <w:rFonts w:ascii="Abade" w:hAnsi="Abade"/>
+          <w:sz w:val="24"/>
+          <w:szCs w:val="24"/>
         </w:rPr>
       </w:r>
     </w:p>
@@ -198,17 +263,27 @@
         <w:jc w:val="left"/>
         <w:rPr>
           <w:rFonts w:ascii="Abade" w:hAnsi="Abade"/>
-          <w:sz w:val="28"/>
-          <w:szCs w:val="28"/>
-        </w:rPr>
-      </w:pPr>
-      <w:r>
-        <w:rPr>
-          <w:rFonts w:ascii="Abade" w:hAnsi="Abade"/>
-          <w:sz w:val="28"/>
-          <w:szCs w:val="28"/>
-        </w:rPr>
-        <w:t>Colton</w:t>
+          <w:sz w:val="24"/>
+          <w:szCs w:val="24"/>
+        </w:rPr>
+      </w:pPr>
+      <w:r>
+        <w:rPr>
+          <w:rFonts w:ascii="Abade" w:hAnsi="Abade"/>
+          <w:sz w:val="24"/>
+          <w:szCs w:val="24"/>
+        </w:rPr>
+        <w:tab/>
+      </w:r>
+      <w:r>
+        <w:rPr>
+          <w:rFonts w:ascii="Abade" w:hAnsi="Abade"/>
+          <w:b w:val="false"/>
+          <w:bCs w:val="false"/>
+          <w:sz w:val="24"/>
+          <w:szCs w:val="24"/>
+        </w:rPr>
+        <w:t>In my recommendation, there should be more research on the items in the most orders in order to expand the customer base. And the items that make the most to expand profits. Look at items that are similar to them and how they perform in their respective markets.</w:t>
       </w:r>
     </w:p>
     <w:p>
@@ -217,11 +292,17 @@
         <w:bidi w:val="0"/>
         <w:jc w:val="left"/>
         <w:rPr>
-          <w:rFonts w:ascii="Liberation Serif" w:hAnsi="Liberation Serif"/>
-        </w:rPr>
-      </w:pPr>
-      <w:r>
-        <w:rPr/>
+          <w:rFonts w:ascii="Abade" w:hAnsi="Abade"/>
+          <w:sz w:val="24"/>
+          <w:szCs w:val="24"/>
+        </w:rPr>
+      </w:pPr>
+      <w:r>
+        <w:rPr>
+          <w:rFonts w:ascii="Abade" w:hAnsi="Abade"/>
+          <w:sz w:val="24"/>
+          <w:szCs w:val="24"/>
+        </w:rPr>
       </w:r>
     </w:p>
     <w:p>
@@ -230,11 +311,17 @@
         <w:bidi w:val="0"/>
         <w:jc w:val="left"/>
         <w:rPr>
-          <w:rFonts w:ascii="Liberation Serif" w:hAnsi="Liberation Serif"/>
-        </w:rPr>
-      </w:pPr>
-      <w:r>
-        <w:rPr/>
+          <w:rFonts w:ascii="Abade" w:hAnsi="Abade"/>
+          <w:sz w:val="24"/>
+          <w:szCs w:val="24"/>
+        </w:rPr>
+      </w:pPr>
+      <w:r>
+        <w:rPr>
+          <w:rFonts w:ascii="Abade" w:hAnsi="Abade"/>
+          <w:sz w:val="24"/>
+          <w:szCs w:val="24"/>
+        </w:rPr>
         <mc:AlternateContent>
           <mc:Choice Requires="wps">
             <w:drawing>
@@ -244,7 +331,7 @@
                   <wp:posOffset>-707390</wp:posOffset>
                 </wp:positionH>
                 <wp:positionV relativeFrom="paragraph">
-                  <wp:posOffset>2505710</wp:posOffset>
+                  <wp:posOffset>1934210</wp:posOffset>
                 </wp:positionV>
                 <wp:extent cx="4191000" cy="0"/>
                 <wp:effectExtent l="27305" t="27305" r="27305" b="27305"/>
@@ -284,7 +371,7 @@
           </mc:Choice>
           <mc:Fallback>
             <w:pict>
-              <v:line id="shape_0" from="-55.7pt,197.3pt" to="274.25pt,197.3pt" ID="Horizontal line 1" stroked="t" o:allowincell="f" style="position:absolute;flip:x">
+              <v:line id="shape_0" from="-55.7pt,152.3pt" to="274.25pt,152.3pt" ID="Horizontal line 1" stroked="t" o:allowincell="f" style="position:absolute;flip:x">
                 <v:stroke color="#3465a4" weight="54720" joinstyle="round" endcap="flat"/>
                 <v:fill o:detectmouseclick="t" on="false"/>
                 <w10:wrap type="none"/>
@@ -301,7 +388,7 @@
                   <wp:posOffset>-707390</wp:posOffset>
                 </wp:positionH>
                 <wp:positionV relativeFrom="paragraph">
-                  <wp:posOffset>2816860</wp:posOffset>
+                  <wp:posOffset>2288540</wp:posOffset>
                 </wp:positionV>
                 <wp:extent cx="2752090" cy="635"/>
                 <wp:effectExtent l="27305" t="27305" r="27305" b="27305"/>
@@ -341,7 +428,7 @@
           </mc:Choice>
           <mc:Fallback>
             <w:pict>
-              <v:line id="shape_0" from="-55.7pt,221.8pt" to="160.95pt,221.8pt" ID="Horizontal line 2" stroked="t" o:allowincell="f" style="position:absolute;flip:x">
+              <v:line id="shape_0" from="-55.7pt,180.2pt" to="160.95pt,180.2pt" ID="Horizontal line 2" stroked="t" o:allowincell="f" style="position:absolute;flip:x">
                 <v:stroke color="#3465a4" weight="54720" joinstyle="round" endcap="flat"/>
                 <v:fill o:detectmouseclick="t" on="false"/>
                 <w10:wrap type="none"/>
@@ -358,7 +445,7 @@
                   <wp:posOffset>-707390</wp:posOffset>
                 </wp:positionH>
                 <wp:positionV relativeFrom="paragraph">
-                  <wp:posOffset>3102610</wp:posOffset>
+                  <wp:posOffset>2652395</wp:posOffset>
                 </wp:positionV>
                 <wp:extent cx="1929765" cy="635"/>
                 <wp:effectExtent l="27305" t="27305" r="27305" b="27305"/>
@@ -398,7 +485,7 @@
           </mc:Choice>
           <mc:Fallback>
             <w:pict>
-              <v:line id="shape_0" from="-55.7pt,244.3pt" to="96.2pt,244.3pt" ID="Horizontal line 3" stroked="t" o:allowincell="f" style="position:absolute;flip:x">
+              <v:line id="shape_0" from="-55.7pt,208.85pt" to="96.2pt,208.85pt" ID="Horizontal line 3" stroked="t" o:allowincell="f" style="position:absolute;flip:x">
                 <v:stroke color="#3465a4" weight="54720" joinstyle="round" endcap="flat"/>
                 <v:fill o:detectmouseclick="t" on="false"/>
                 <w10:wrap type="none"/>
@@ -406,6 +493,14 @@
             </w:pict>
           </mc:Fallback>
         </mc:AlternateContent>
+      </w:r>
+      <w:r>
+        <w:rPr>
+          <w:rFonts w:ascii="Abade" w:hAnsi="Abade"/>
+          <w:sz w:val="24"/>
+          <w:szCs w:val="24"/>
+        </w:rPr>
+        <w:t>Colton</w:t>
       </w:r>
     </w:p>
     <w:sectPr>

</xml_diff>